<commit_message>
Add variable signer loops to SAFE consent templates
</commit_message>
<xml_diff>
--- a/content/templates/openagreements-board-consent-safe/template.docx
+++ b/content/templates/openagreements-board-consent-safe/template.docx
@@ -208,6 +208,14 @@
     </w:p>
     <w:p>
       <w:pPr>
+        <w:pStyle w:val="Normal"/>
+      </w:pPr>
+      <w:r>
+        <w:t xml:space="preserve">{FOR member IN board_members}</w:t>
+      </w:r>
+    </w:p>
+    <w:p>
+      <w:pPr>
         <w:pStyle w:val="OABlockSignatureLine"/>
       </w:pPr>
       <w:r>
@@ -219,7 +227,7 @@
         <w:pStyle w:val="OABlockSignatureName"/>
       </w:pPr>
       <w:r>
-        <w:t xml:space="preserve">{board_member_1_name}</w:t>
+        <w:t xml:space="preserve">{$member.name}</w:t>
       </w:r>
     </w:p>
     <w:p>
@@ -235,56 +243,10 @@
     </w:p>
     <w:p>
       <w:pPr>
-        <w:pStyle w:val="OABlockSignatureLine"/>
-      </w:pPr>
-      <w:r>
-        <w:t xml:space="preserve">______________________________</w:t>
-      </w:r>
-    </w:p>
-    <w:p>
-      <w:pPr>
-        <w:pStyle w:val="OABlockSignatureName"/>
-      </w:pPr>
-      <w:r>
-        <w:t xml:space="preserve">{board_member_2_name}</w:t>
-      </w:r>
-    </w:p>
-    <w:p>
-      <w:pPr>
-        <w:pStyle w:val="OABlockSignatureDate"/>
-      </w:pPr>
-      <w:r>
-        <w:t xml:space="preserve">Date: </w:t>
-      </w:r>
-      <w:r>
-        <w:t xml:space="preserve">{effective_date}</w:t>
-      </w:r>
-    </w:p>
-    <w:p>
-      <w:pPr>
-        <w:pStyle w:val="OABlockSignatureLine"/>
-      </w:pPr>
-      <w:r>
-        <w:t xml:space="preserve">______________________________</w:t>
-      </w:r>
-    </w:p>
-    <w:p>
-      <w:pPr>
-        <w:pStyle w:val="OABlockSignatureName"/>
-      </w:pPr>
-      <w:r>
-        <w:t xml:space="preserve">{board_member_3_name}</w:t>
-      </w:r>
-    </w:p>
-    <w:p>
-      <w:pPr>
-        <w:pStyle w:val="OABlockSignatureDate"/>
-      </w:pPr>
-      <w:r>
-        <w:t xml:space="preserve">Date: </w:t>
-      </w:r>
-      <w:r>
-        <w:t xml:space="preserve">{effective_date}</w:t>
+        <w:pStyle w:val="Normal"/>
+      </w:pPr>
+      <w:r>
+        <w:t xml:space="preserve">{END-FOR member}</w:t>
       </w:r>
     </w:p>
     <w:sectPr>

</xml_diff>

<commit_message>
Add variable signer loops to SAFE consent templates (#178)
</commit_message>
<xml_diff>
--- a/content/templates/openagreements-board-consent-safe/template.docx
+++ b/content/templates/openagreements-board-consent-safe/template.docx
@@ -208,6 +208,14 @@
     </w:p>
     <w:p>
       <w:pPr>
+        <w:pStyle w:val="Normal"/>
+      </w:pPr>
+      <w:r>
+        <w:t xml:space="preserve">{FOR member IN board_members}</w:t>
+      </w:r>
+    </w:p>
+    <w:p>
+      <w:pPr>
         <w:pStyle w:val="OABlockSignatureLine"/>
       </w:pPr>
       <w:r>
@@ -219,7 +227,7 @@
         <w:pStyle w:val="OABlockSignatureName"/>
       </w:pPr>
       <w:r>
-        <w:t xml:space="preserve">{board_member_1_name}</w:t>
+        <w:t xml:space="preserve">{$member.name}</w:t>
       </w:r>
     </w:p>
     <w:p>
@@ -235,56 +243,10 @@
     </w:p>
     <w:p>
       <w:pPr>
-        <w:pStyle w:val="OABlockSignatureLine"/>
-      </w:pPr>
-      <w:r>
-        <w:t xml:space="preserve">______________________________</w:t>
-      </w:r>
-    </w:p>
-    <w:p>
-      <w:pPr>
-        <w:pStyle w:val="OABlockSignatureName"/>
-      </w:pPr>
-      <w:r>
-        <w:t xml:space="preserve">{board_member_2_name}</w:t>
-      </w:r>
-    </w:p>
-    <w:p>
-      <w:pPr>
-        <w:pStyle w:val="OABlockSignatureDate"/>
-      </w:pPr>
-      <w:r>
-        <w:t xml:space="preserve">Date: </w:t>
-      </w:r>
-      <w:r>
-        <w:t xml:space="preserve">{effective_date}</w:t>
-      </w:r>
-    </w:p>
-    <w:p>
-      <w:pPr>
-        <w:pStyle w:val="OABlockSignatureLine"/>
-      </w:pPr>
-      <w:r>
-        <w:t xml:space="preserve">______________________________</w:t>
-      </w:r>
-    </w:p>
-    <w:p>
-      <w:pPr>
-        <w:pStyle w:val="OABlockSignatureName"/>
-      </w:pPr>
-      <w:r>
-        <w:t xml:space="preserve">{board_member_3_name}</w:t>
-      </w:r>
-    </w:p>
-    <w:p>
-      <w:pPr>
-        <w:pStyle w:val="OABlockSignatureDate"/>
-      </w:pPr>
-      <w:r>
-        <w:t xml:space="preserve">Date: </w:t>
-      </w:r>
-      <w:r>
-        <w:t xml:space="preserve">{effective_date}</w:t>
+        <w:pStyle w:val="Normal"/>
+      </w:pPr>
+      <w:r>
+        <w:t xml:space="preserve">{END-FOR member}</w:t>
       </w:r>
     </w:p>
     <w:sectPr>

</xml_diff>

<commit_message>
refactor: refine SAFE board consent cover terms and signatures
</commit_message>
<xml_diff>
--- a/content/templates/openagreements-board-consent-safe/template.docx
+++ b/content/templates/openagreements-board-consent-safe/template.docx
@@ -78,7 +78,7 @@
                 <w:sz w:val="16"/>
                 <w:szCs w:val="16"/>
               </w:rPr>
-              <w:t xml:space="preserve">The key business terms of this board consent are as follows.</w:t>
+              <w:t xml:space="preserve">The key terms reflected on this cover page are as follows. This action by written consent of the Board (this "Board Consent") consists of (a) this cover page (this "Cover Page") and (b) the resolutions attached hereto (the "Resolutions"). If there is any conflict between the Cover Page and the Resolutions, the Cover Page controls.</w:t>
             </w:r>
           </w:p>
         </w:tc>
@@ -270,7 +270,311 @@
                 <w:sz w:val="22"/>
                 <w:szCs w:val="22"/>
               </w:rPr>
-              <w:t xml:space="preserve">Aggregate SAFE Purchase Amount</w:t>
+              <w:t xml:space="preserve">Instrument</w:t>
+            </w:r>
+          </w:p>
+        </w:tc>
+        <w:tc>
+          <w:tcPr>
+            <w:tcBorders>
+              <w:top w:val="single" w:color="C7C7C7" w:sz="4"/>
+              <w:left w:val="nil" w:color="FFFFFF" w:sz="0"/>
+              <w:bottom w:val="single" w:color="C7C7C7" w:sz="4"/>
+              <w:right w:val="nil" w:color="FFFFFF" w:sz="0"/>
+            </w:tcBorders>
+            <w:tcMar>
+              <w:top w:type="dxa" w:w="80"/>
+              <w:left w:type="dxa" w:w="115"/>
+              <w:bottom w:type="dxa" w:w="80"/>
+              <w:right w:type="dxa" w:w="115"/>
+            </w:tcMar>
+            <w:vAlign w:val="center"/>
+          </w:tcPr>
+          <w:p>
+            <w:pPr>
+              <w:spacing w:after="0" w:before="0" w:line="340" w:beforeAutospacing="false" w:afterAutospacing="false"/>
+              <w:contextualSpacing w:val="false"/>
+            </w:pPr>
+            <w:r>
+              <w:rPr>
+                <w:rFonts w:ascii="Arial" w:cs="Arial" w:eastAsia="Arial" w:hAnsi="Arial"/>
+                <w:b w:val="false"/>
+                <w:bCs w:val="false"/>
+                <w:i w:val="false"/>
+                <w:iCs w:val="false"/>
+                <w:color w:val="1D2021"/>
+                <w:sz w:val="22"/>
+                <w:szCs w:val="22"/>
+              </w:rPr>
+              <w:t xml:space="preserve">Simple Agreement for Future Equity ("SAFE")</w:t>
+            </w:r>
+          </w:p>
+        </w:tc>
+      </w:tr>
+      <w:tr>
+        <w:trPr>
+          <w:trHeight w:val="700" w:hRule="atLeast"/>
+        </w:trPr>
+        <w:tc>
+          <w:tcPr>
+            <w:tcBorders>
+              <w:top w:val="single" w:color="C7C7C7" w:sz="4"/>
+              <w:left w:val="nil" w:color="FFFFFF" w:sz="0"/>
+              <w:bottom w:val="single" w:color="C7C7C7" w:sz="4"/>
+              <w:right w:val="nil" w:color="FFFFFF" w:sz="0"/>
+            </w:tcBorders>
+            <w:tcMar>
+              <w:top w:type="dxa" w:w="80"/>
+              <w:left w:type="dxa" w:w="345"/>
+              <w:bottom w:type="dxa" w:w="80"/>
+              <w:right w:type="dxa" w:w="115"/>
+            </w:tcMar>
+            <w:vAlign w:val="center"/>
+          </w:tcPr>
+          <w:p>
+            <w:pPr>
+              <w:spacing w:after="0" w:before="0" w:line="340"/>
+            </w:pPr>
+            <w:r>
+              <w:rPr>
+                <w:rFonts w:ascii="Arial" w:cs="Arial" w:eastAsia="Arial" w:hAnsi="Arial"/>
+                <w:b w:val="false"/>
+                <w:bCs w:val="false"/>
+                <w:i/>
+                <w:iCs/>
+                <w:color w:val="494A4B"/>
+                <w:sz w:val="20"/>
+                <w:szCs w:val="20"/>
+              </w:rPr>
+              <w:t xml:space="preserve">Valuation Cap (Post-Money)</w:t>
+            </w:r>
+          </w:p>
+        </w:tc>
+        <w:tc>
+          <w:tcPr>
+            <w:tcBorders>
+              <w:top w:val="single" w:color="C7C7C7" w:sz="4"/>
+              <w:left w:val="nil" w:color="FFFFFF" w:sz="0"/>
+              <w:bottom w:val="single" w:color="C7C7C7" w:sz="4"/>
+              <w:right w:val="nil" w:color="FFFFFF" w:sz="0"/>
+            </w:tcBorders>
+            <w:tcMar>
+              <w:top w:type="dxa" w:w="80"/>
+              <w:left w:type="dxa" w:w="115"/>
+              <w:bottom w:type="dxa" w:w="80"/>
+              <w:right w:type="dxa" w:w="115"/>
+            </w:tcMar>
+            <w:vAlign w:val="center"/>
+          </w:tcPr>
+          <w:p>
+            <w:pPr>
+              <w:spacing w:after="0" w:before="0" w:line="340" w:beforeAutospacing="false" w:afterAutospacing="false"/>
+              <w:contextualSpacing w:val="false"/>
+            </w:pPr>
+            <w:r>
+              <w:rPr>
+                <w:rFonts w:ascii="Arial" w:cs="Arial" w:eastAsia="Arial" w:hAnsi="Arial"/>
+                <w:b w:val="false"/>
+                <w:bCs w:val="false"/>
+                <w:i w:val="false"/>
+                <w:iCs w:val="false"/>
+                <w:color w:val="1D2021"/>
+                <w:sz w:val="22"/>
+                <w:szCs w:val="22"/>
+              </w:rPr>
+              <w:t xml:space="preserve">{safe_valuation_cap}</w:t>
+            </w:r>
+          </w:p>
+        </w:tc>
+      </w:tr>
+      <w:tr>
+        <w:trPr>
+          <w:trHeight w:val="700" w:hRule="atLeast"/>
+        </w:trPr>
+        <w:tc>
+          <w:tcPr>
+            <w:tcBorders>
+              <w:top w:val="single" w:color="C7C7C7" w:sz="4"/>
+              <w:left w:val="nil" w:color="FFFFFF" w:sz="0"/>
+              <w:bottom w:val="single" w:color="C7C7C7" w:sz="4"/>
+              <w:right w:val="nil" w:color="FFFFFF" w:sz="0"/>
+            </w:tcBorders>
+            <w:tcMar>
+              <w:top w:type="dxa" w:w="80"/>
+              <w:left w:type="dxa" w:w="345"/>
+              <w:bottom w:type="dxa" w:w="80"/>
+              <w:right w:type="dxa" w:w="115"/>
+            </w:tcMar>
+            <w:vAlign w:val="center"/>
+          </w:tcPr>
+          <w:p>
+            <w:pPr>
+              <w:spacing w:after="0" w:before="0" w:line="340"/>
+            </w:pPr>
+            <w:r>
+              <w:rPr>
+                <w:rFonts w:ascii="Arial" w:cs="Arial" w:eastAsia="Arial" w:hAnsi="Arial"/>
+                <w:b w:val="false"/>
+                <w:bCs w:val="false"/>
+                <w:i/>
+                <w:iCs/>
+                <w:color w:val="494A4B"/>
+                <w:sz w:val="20"/>
+                <w:szCs w:val="20"/>
+              </w:rPr>
+              <w:t xml:space="preserve">Discount Rate</w:t>
+            </w:r>
+          </w:p>
+        </w:tc>
+        <w:tc>
+          <w:tcPr>
+            <w:tcBorders>
+              <w:top w:val="single" w:color="C7C7C7" w:sz="4"/>
+              <w:left w:val="nil" w:color="FFFFFF" w:sz="0"/>
+              <w:bottom w:val="single" w:color="C7C7C7" w:sz="4"/>
+              <w:right w:val="nil" w:color="FFFFFF" w:sz="0"/>
+            </w:tcBorders>
+            <w:tcMar>
+              <w:top w:type="dxa" w:w="80"/>
+              <w:left w:type="dxa" w:w="115"/>
+              <w:bottom w:type="dxa" w:w="80"/>
+              <w:right w:type="dxa" w:w="115"/>
+            </w:tcMar>
+            <w:vAlign w:val="center"/>
+          </w:tcPr>
+          <w:p>
+            <w:pPr>
+              <w:spacing w:after="0" w:before="0" w:line="340" w:beforeAutospacing="false" w:afterAutospacing="false"/>
+              <w:contextualSpacing w:val="false"/>
+            </w:pPr>
+            <w:r>
+              <w:rPr>
+                <w:rFonts w:ascii="Arial" w:cs="Arial" w:eastAsia="Arial" w:hAnsi="Arial"/>
+                <w:b w:val="false"/>
+                <w:bCs w:val="false"/>
+                <w:i w:val="false"/>
+                <w:iCs w:val="false"/>
+                <w:color w:val="1D2021"/>
+                <w:sz w:val="22"/>
+                <w:szCs w:val="22"/>
+              </w:rPr>
+              <w:t xml:space="preserve">{safe_discount_rate}</w:t>
+            </w:r>
+          </w:p>
+        </w:tc>
+      </w:tr>
+      <w:tr>
+        <w:trPr>
+          <w:trHeight w:val="700" w:hRule="atLeast"/>
+        </w:trPr>
+        <w:tc>
+          <w:tcPr>
+            <w:tcBorders>
+              <w:top w:val="single" w:color="C7C7C7" w:sz="4"/>
+              <w:left w:val="nil" w:color="FFFFFF" w:sz="0"/>
+              <w:bottom w:val="single" w:color="C7C7C7" w:sz="4"/>
+              <w:right w:val="nil" w:color="FFFFFF" w:sz="0"/>
+            </w:tcBorders>
+            <w:tcMar>
+              <w:top w:type="dxa" w:w="80"/>
+              <w:left w:type="dxa" w:w="345"/>
+              <w:bottom w:type="dxa" w:w="80"/>
+              <w:right w:type="dxa" w:w="115"/>
+            </w:tcMar>
+            <w:vAlign w:val="center"/>
+          </w:tcPr>
+          <w:p>
+            <w:pPr>
+              <w:spacing w:after="0" w:before="0" w:line="340"/>
+            </w:pPr>
+            <w:r>
+              <w:rPr>
+                <w:rFonts w:ascii="Arial" w:cs="Arial" w:eastAsia="Arial" w:hAnsi="Arial"/>
+                <w:b w:val="false"/>
+                <w:bCs w:val="false"/>
+                <w:i/>
+                <w:iCs/>
+                <w:color w:val="494A4B"/>
+                <w:sz w:val="20"/>
+                <w:szCs w:val="20"/>
+              </w:rPr>
+              <w:t xml:space="preserve">Changes to Standard Terms</w:t>
+            </w:r>
+          </w:p>
+        </w:tc>
+        <w:tc>
+          <w:tcPr>
+            <w:tcBorders>
+              <w:top w:val="single" w:color="C7C7C7" w:sz="4"/>
+              <w:left w:val="nil" w:color="FFFFFF" w:sz="0"/>
+              <w:bottom w:val="single" w:color="C7C7C7" w:sz="4"/>
+              <w:right w:val="nil" w:color="FFFFFF" w:sz="0"/>
+            </w:tcBorders>
+            <w:tcMar>
+              <w:top w:type="dxa" w:w="80"/>
+              <w:left w:type="dxa" w:w="115"/>
+              <w:bottom w:type="dxa" w:w="80"/>
+              <w:right w:type="dxa" w:w="115"/>
+            </w:tcMar>
+            <w:vAlign w:val="center"/>
+          </w:tcPr>
+          <w:p>
+            <w:pPr>
+              <w:spacing w:after="0" w:before="0" w:line="340" w:beforeAutospacing="false" w:afterAutospacing="false"/>
+              <w:contextualSpacing w:val="false"/>
+            </w:pPr>
+            <w:r>
+              <w:rPr>
+                <w:rFonts w:ascii="Arial" w:cs="Arial" w:eastAsia="Arial" w:hAnsi="Arial"/>
+                <w:b w:val="false"/>
+                <w:bCs w:val="false"/>
+                <w:i w:val="false"/>
+                <w:iCs w:val="false"/>
+                <w:color w:val="1D2021"/>
+                <w:sz w:val="22"/>
+                <w:szCs w:val="22"/>
+              </w:rPr>
+              <w:t xml:space="preserve">{safe_changes_to_standard_terms}</w:t>
+            </w:r>
+          </w:p>
+        </w:tc>
+      </w:tr>
+      <w:tr>
+        <w:trPr>
+          <w:trHeight w:val="700" w:hRule="atLeast"/>
+        </w:trPr>
+        <w:tc>
+          <w:tcPr>
+            <w:tcBorders>
+              <w:top w:val="single" w:color="C7C7C7" w:sz="4"/>
+              <w:left w:val="nil" w:color="FFFFFF" w:sz="0"/>
+              <w:bottom w:val="single" w:color="C7C7C7" w:sz="4"/>
+              <w:right w:val="nil" w:color="FFFFFF" w:sz="0"/>
+            </w:tcBorders>
+            <w:tcMar>
+              <w:top w:type="dxa" w:w="80"/>
+              <w:left w:type="dxa" w:w="115"/>
+              <w:bottom w:type="dxa" w:w="80"/>
+              <w:right w:type="dxa" w:w="115"/>
+            </w:tcMar>
+            <w:vAlign w:val="center"/>
+          </w:tcPr>
+          <w:p>
+            <w:pPr>
+              <w:spacing w:after="0" w:before="0" w:line="340"/>
+            </w:pPr>
+            <w:r>
+              <w:rPr>
+                <w:rFonts w:ascii="Arial" w:cs="Arial" w:eastAsia="Arial" w:hAnsi="Arial"/>
+                <w:b/>
+                <w:bCs/>
+                <w:i w:val="false"/>
+                <w:iCs w:val="false"/>
+                <w:color w:val="1D2021"/>
+                <w:sz w:val="22"/>
+                <w:szCs w:val="22"/>
+              </w:rPr>
+              <w:t xml:space="preserve">Maximum Aggregate SAFE Purchase Amount</w:t>
             </w:r>
           </w:p>
         </w:tc>
@@ -311,82 +615,6 @@
           </w:p>
         </w:tc>
       </w:tr>
-      <w:tr>
-        <w:trPr>
-          <w:trHeight w:val="700" w:hRule="atLeast"/>
-        </w:trPr>
-        <w:tc>
-          <w:tcPr>
-            <w:tcBorders>
-              <w:top w:val="single" w:color="C7C7C7" w:sz="4"/>
-              <w:left w:val="nil" w:color="FFFFFF" w:sz="0"/>
-              <w:bottom w:val="single" w:color="C7C7C7" w:sz="4"/>
-              <w:right w:val="nil" w:color="FFFFFF" w:sz="0"/>
-            </w:tcBorders>
-            <w:tcMar>
-              <w:top w:type="dxa" w:w="80"/>
-              <w:left w:type="dxa" w:w="115"/>
-              <w:bottom w:type="dxa" w:w="80"/>
-              <w:right w:type="dxa" w:w="115"/>
-            </w:tcMar>
-            <w:vAlign w:val="center"/>
-          </w:tcPr>
-          <w:p>
-            <w:pPr>
-              <w:spacing w:after="0" w:before="0" w:line="340"/>
-            </w:pPr>
-            <w:r>
-              <w:rPr>
-                <w:rFonts w:ascii="Arial" w:cs="Arial" w:eastAsia="Arial" w:hAnsi="Arial"/>
-                <w:b/>
-                <w:bCs/>
-                <w:i w:val="false"/>
-                <w:iCs w:val="false"/>
-                <w:color w:val="1D2021"/>
-                <w:sz w:val="22"/>
-                <w:szCs w:val="22"/>
-              </w:rPr>
-              <w:t xml:space="preserve">Governing Law</w:t>
-            </w:r>
-          </w:p>
-        </w:tc>
-        <w:tc>
-          <w:tcPr>
-            <w:tcBorders>
-              <w:top w:val="single" w:color="C7C7C7" w:sz="4"/>
-              <w:left w:val="nil" w:color="FFFFFF" w:sz="0"/>
-              <w:bottom w:val="single" w:color="C7C7C7" w:sz="4"/>
-              <w:right w:val="nil" w:color="FFFFFF" w:sz="0"/>
-            </w:tcBorders>
-            <w:tcMar>
-              <w:top w:type="dxa" w:w="80"/>
-              <w:left w:type="dxa" w:w="115"/>
-              <w:bottom w:type="dxa" w:w="80"/>
-              <w:right w:type="dxa" w:w="115"/>
-            </w:tcMar>
-            <w:vAlign w:val="center"/>
-          </w:tcPr>
-          <w:p>
-            <w:pPr>
-              <w:spacing w:after="0" w:before="0" w:line="340" w:beforeAutospacing="false" w:afterAutospacing="false"/>
-              <w:contextualSpacing w:val="false"/>
-            </w:pPr>
-            <w:r>
-              <w:rPr>
-                <w:rFonts w:ascii="Arial" w:cs="Arial" w:eastAsia="Arial" w:hAnsi="Arial"/>
-                <w:b w:val="false"/>
-                <w:bCs w:val="false"/>
-                <w:i w:val="false"/>
-                <w:iCs w:val="false"/>
-                <w:color w:val="1D2021"/>
-                <w:sz w:val="22"/>
-                <w:szCs w:val="22"/>
-              </w:rPr>
-              <w:t xml:space="preserve">Delaware</w:t>
-            </w:r>
-          </w:p>
-        </w:tc>
-      </w:tr>
     </w:tbl>
     <w:p>
       <w:pPr>
@@ -414,7 +642,7 @@
           <w:sz w:val="22"/>
           <w:szCs w:val="22"/>
         </w:rPr>
-        <w:t xml:space="preserve">Standard Terms</w:t>
+        <w:t xml:space="preserve">Resolutions</w:t>
       </w:r>
     </w:p>
     <w:p>
@@ -432,7 +660,7 @@
           <w:sz w:val="22"/>
           <w:szCs w:val="22"/>
         </w:rPr>
-        <w:t xml:space="preserve">1. Board Action Under Delaware Law.</w:t>
+        <w:t xml:space="preserve">1. Action by Written Consent of the Board.</w:t>
       </w:r>
     </w:p>
     <w:p>
@@ -452,25 +680,7 @@
           <w:sz w:val="22"/>
           <w:szCs w:val="22"/>
         </w:rPr>
-        <w:t xml:space="preserve">All members of the Board of Directors of Company adopt this action by unanimous written consent pursuant to Section 141(f) of the Delaware General Corporation Law.</w:t>
-      </w:r>
-    </w:p>
-    <w:p>
-      <w:pPr>
-        <w:pStyle w:val="OAClauseHeading"/>
-        <w:spacing w:after="120" w:before="320" w:line="340" w:beforeAutospacing="false" w:afterAutospacing="false"/>
-        <w:contextualSpacing w:val="false"/>
-      </w:pPr>
-      <w:r>
-        <w:rPr>
-          <w:rFonts w:ascii="Arial" w:cs="Arial" w:eastAsia="Arial" w:hAnsi="Arial"/>
-          <w:b/>
-          <w:bCs/>
-          <w:color w:val="1D2021"/>
-          <w:sz w:val="22"/>
-          <w:szCs w:val="22"/>
-        </w:rPr>
-        <w:t xml:space="preserve">2. Approval of SAFE Financing.</w:t>
+        <w:t xml:space="preserve">The undersigned, constituting all of the members of the Board of Directors (the "Board") of {company_name}, a Delaware corporation (the "Company"), pursuant to Section 141(f) of the Delaware General Corporation Law, hereby adopt the following resolutions by written consent.</w:t>
       </w:r>
     </w:p>
     <w:p>
@@ -490,7 +700,7 @@
           <w:sz w:val="22"/>
           <w:szCs w:val="22"/>
         </w:rPr>
-        <w:t xml:space="preserve">Board has determined that it is in the best interests of Company to enter into one or more Simple Agreements for Future Equity, or SAFEs, for the aggregate purchase amount listed in Cover Terms, and each SAFE in substantially the form presented to Board is approved.</w:t>
+        <w:t xml:space="preserve">This action by written consent (this "Board Consent") records the approval reflected on the Cover Page and the resolutions below.</w:t>
       </w:r>
     </w:p>
     <w:p>
@@ -508,7 +718,7 @@
           <w:sz w:val="22"/>
           <w:szCs w:val="22"/>
         </w:rPr>
-        <w:t xml:space="preserve">3. Officer Authority.</w:t>
+        <w:t xml:space="preserve">2. Approval of SAFE Financing.</w:t>
       </w:r>
     </w:p>
     <w:p>
@@ -528,25 +738,7 @@
           <w:sz w:val="22"/>
           <w:szCs w:val="22"/>
         </w:rPr>
-        <w:t xml:space="preserve">Each officer of Company is authorized and directed, for and on behalf of Company, to execute and deliver each SAFE and any related agreements, certificates, notices, or other documents required or contemplated by any SAFE or otherwise necessary or appropriate in connection with the SAFE financing.</w:t>
-      </w:r>
-    </w:p>
-    <w:p>
-      <w:pPr>
-        <w:pStyle w:val="OAClauseHeading"/>
-        <w:spacing w:after="120" w:before="320" w:line="340" w:beforeAutospacing="false" w:afterAutospacing="false"/>
-        <w:contextualSpacing w:val="false"/>
-      </w:pPr>
-      <w:r>
-        <w:rPr>
-          <w:rFonts w:ascii="Arial" w:cs="Arial" w:eastAsia="Arial" w:hAnsi="Arial"/>
-          <w:b/>
-          <w:bCs/>
-          <w:color w:val="1D2021"/>
-          <w:sz w:val="22"/>
-          <w:szCs w:val="22"/>
-        </w:rPr>
-        <w:t xml:space="preserve">4. Negotiated Changes.</w:t>
+        <w:t xml:space="preserve">WHEREAS, the Board believes it is in the best interests of the Company to approve the issuance by the Company of one or more SAFEs (each, a "SAFE", and together, the "SAFEs"), of the type described in the Cover Terms, for an aggregate purchase amount of up to the Maximum Aggregate SAFE Purchase Amount listed in the Cover Terms, in accordance with their terms.</w:t>
       </w:r>
     </w:p>
     <w:p>
@@ -566,25 +758,7 @@
           <w:sz w:val="22"/>
           <w:szCs w:val="22"/>
         </w:rPr>
-        <w:t xml:space="preserve">Each officer of Company is further authorized to negotiate and approve additions, modifications, amendments, or deletions to any SAFE or related document, and execution and delivery by that officer will be conclusive evidence of that approval.</w:t>
-      </w:r>
-    </w:p>
-    <w:p>
-      <w:pPr>
-        <w:pStyle w:val="OAClauseHeading"/>
-        <w:spacing w:after="120" w:before="320" w:line="340" w:beforeAutospacing="false" w:afterAutospacing="false"/>
-        <w:contextualSpacing w:val="false"/>
-      </w:pPr>
-      <w:r>
-        <w:rPr>
-          <w:rFonts w:ascii="Arial" w:cs="Arial" w:eastAsia="Arial" w:hAnsi="Arial"/>
-          <w:b/>
-          <w:bCs/>
-          <w:color w:val="1D2021"/>
-          <w:sz w:val="22"/>
-          <w:szCs w:val="22"/>
-        </w:rPr>
-        <w:t xml:space="preserve">5. Reservation and Issuance of Shares.</w:t>
+        <w:t xml:space="preserve">RESOLVED, that the issuance by the Company of each SAFE, in substantially the form presented to the Board, be, and it hereby is, approved in all respects.</w:t>
       </w:r>
     </w:p>
     <w:p>
@@ -604,7 +778,7 @@
           <w:sz w:val="22"/>
           <w:szCs w:val="22"/>
         </w:rPr>
-        <w:t xml:space="preserve">Shares of Company capital stock issuable upon conversion of each SAFE are reserved for issuance, and when issued in accordance with the applicable SAFE, those shares will be duly and validly issued, fully paid, and nonassessable.</w:t>
+        <w:t xml:space="preserve">RESOLVED FURTHER, that the officers of the Company be, and each of them hereby is, authorized and directed, for and on behalf of the Company, to execute and deliver each SAFE, and any and all other agreements, certificates or documents required or contemplated by any SAFE or deemed necessary or appropriate in connection therewith, and to take all actions deemed necessary or appropriate to cause the Company's obligations thereunder to be performed.</w:t>
       </w:r>
     </w:p>
     <w:p>
@@ -622,7 +796,7 @@
           <w:sz w:val="22"/>
           <w:szCs w:val="22"/>
         </w:rPr>
-        <w:t xml:space="preserve">6. Securities Law Compliance.</w:t>
+        <w:t xml:space="preserve">3. Officer Authority.</w:t>
       </w:r>
     </w:p>
     <w:p>
@@ -642,7 +816,7 @@
           <w:sz w:val="22"/>
           <w:szCs w:val="22"/>
         </w:rPr>
-        <w:t xml:space="preserve">The SAFE financing is approved to be offered and sold in reliance on applicable exemptions from registration under the Securities Act of 1933, as amended, and applicable state securities laws. Each officer of Company is authorized to execute and file any forms, certificates, notices, or other documents that are necessary or appropriate in connection with that compliance.</w:t>
+        <w:t xml:space="preserve">Each officer of the Company is authorized and directed, for and on behalf of the Company, to execute and deliver each SAFE and any related agreements, certificates, notices, or other documents required or contemplated by any SAFE or otherwise necessary or appropriate in connection with the SAFE financing.</w:t>
       </w:r>
     </w:p>
     <w:p>
@@ -660,7 +834,7 @@
           <w:sz w:val="22"/>
           <w:szCs w:val="22"/>
         </w:rPr>
-        <w:t xml:space="preserve">7. Further Actions.</w:t>
+        <w:t xml:space="preserve">4. Negotiated Changes.</w:t>
       </w:r>
     </w:p>
     <w:p>
@@ -680,7 +854,141 @@
           <w:sz w:val="22"/>
           <w:szCs w:val="22"/>
         </w:rPr>
-        <w:t xml:space="preserve">Each officer of Company is authorized and directed to take any further actions and execute any additional documents necessary or appropriate to implement these approvals.</w:t>
+        <w:t xml:space="preserve">Each officer of the Company is further authorized to negotiate and approve additions, modifications, amendments, or deletions to any SAFE or related document, and execution and delivery by that officer will be conclusive evidence of that approval.</w:t>
+      </w:r>
+    </w:p>
+    <w:p>
+      <w:pPr>
+        <w:pStyle w:val="OAClauseHeading"/>
+        <w:spacing w:after="120" w:before="320" w:line="340" w:beforeAutospacing="false" w:afterAutospacing="false"/>
+        <w:contextualSpacing w:val="false"/>
+      </w:pPr>
+      <w:r>
+        <w:rPr>
+          <w:rFonts w:ascii="Arial" w:cs="Arial" w:eastAsia="Arial" w:hAnsi="Arial"/>
+          <w:b/>
+          <w:bCs/>
+          <w:color w:val="1D2021"/>
+          <w:sz w:val="22"/>
+          <w:szCs w:val="22"/>
+        </w:rPr>
+        <w:t xml:space="preserve">5. Reservation and Issuance of Shares.</w:t>
+      </w:r>
+    </w:p>
+    <w:p>
+      <w:pPr>
+        <w:pStyle w:val="OAClauseBody"/>
+        <w:spacing w:after="280" w:before="0" w:line="340" w:beforeAutospacing="false" w:afterAutospacing="false"/>
+        <w:contextualSpacing w:val="false"/>
+      </w:pPr>
+      <w:r>
+        <w:rPr>
+          <w:rFonts w:ascii="Arial" w:cs="Arial" w:eastAsia="Arial" w:hAnsi="Arial"/>
+          <w:b w:val="false"/>
+          <w:bCs w:val="false"/>
+          <w:i w:val="false"/>
+          <w:iCs w:val="false"/>
+          <w:color w:val="1D2021"/>
+          <w:sz w:val="22"/>
+          <w:szCs w:val="22"/>
+        </w:rPr>
+        <w:t xml:space="preserve">RESOLVED FURTHER, that shares of the Company's capital stock issuable upon conversion of each SAFE be, and they hereby are, reserved for issuance upon conversion of such SAFE in accordance with its terms.</w:t>
+      </w:r>
+    </w:p>
+    <w:p>
+      <w:pPr>
+        <w:pStyle w:val="OAClauseBody"/>
+        <w:spacing w:after="280" w:before="0" w:line="340" w:beforeAutospacing="false" w:afterAutospacing="false"/>
+        <w:contextualSpacing w:val="false"/>
+      </w:pPr>
+      <w:r>
+        <w:rPr>
+          <w:rFonts w:ascii="Arial" w:cs="Arial" w:eastAsia="Arial" w:hAnsi="Arial"/>
+          <w:b w:val="false"/>
+          <w:bCs w:val="false"/>
+          <w:i w:val="false"/>
+          <w:iCs w:val="false"/>
+          <w:color w:val="1D2021"/>
+          <w:sz w:val="22"/>
+          <w:szCs w:val="22"/>
+        </w:rPr>
+        <w:t xml:space="preserve">RESOLVED FURTHER, that when shares of the Company's capital stock are issued upon conversion of any SAFE in accordance with its terms, such shares shall be duly and validly issued, fully paid and nonassessable.</w:t>
+      </w:r>
+    </w:p>
+    <w:p>
+      <w:pPr>
+        <w:pStyle w:val="OAClauseHeading"/>
+        <w:spacing w:after="120" w:before="320" w:line="340" w:beforeAutospacing="false" w:afterAutospacing="false"/>
+        <w:contextualSpacing w:val="false"/>
+      </w:pPr>
+      <w:r>
+        <w:rPr>
+          <w:rFonts w:ascii="Arial" w:cs="Arial" w:eastAsia="Arial" w:hAnsi="Arial"/>
+          <w:b/>
+          <w:bCs/>
+          <w:color w:val="1D2021"/>
+          <w:sz w:val="22"/>
+          <w:szCs w:val="22"/>
+        </w:rPr>
+        <w:t xml:space="preserve">6. Securities Law Compliance.</w:t>
+      </w:r>
+    </w:p>
+    <w:p>
+      <w:pPr>
+        <w:pStyle w:val="OAClauseBody"/>
+        <w:spacing w:after="280" w:before="0" w:line="340" w:beforeAutospacing="false" w:afterAutospacing="false"/>
+        <w:contextualSpacing w:val="false"/>
+      </w:pPr>
+      <w:r>
+        <w:rPr>
+          <w:rFonts w:ascii="Arial" w:cs="Arial" w:eastAsia="Arial" w:hAnsi="Arial"/>
+          <w:b w:val="false"/>
+          <w:bCs w:val="false"/>
+          <w:i w:val="false"/>
+          <w:iCs w:val="false"/>
+          <w:color w:val="1D2021"/>
+          <w:sz w:val="22"/>
+          <w:szCs w:val="22"/>
+        </w:rPr>
+        <w:t xml:space="preserve">RESOLVED FURTHER, that each SAFE shall be offered and sold in reliance on any applicable exemption from registration provided by the Securities Act of 1933, as amended, and any applicable exemption under applicable state blue sky laws, and that the officers of the Company be, and each of them hereby is, authorized and directed, for and on behalf of the Company, to execute and file any forms, certificates, notices or other documents that are necessary or appropriate pursuant to federal or state securities laws.</w:t>
+      </w:r>
+    </w:p>
+    <w:p>
+      <w:pPr>
+        <w:pStyle w:val="OAClauseHeading"/>
+        <w:spacing w:after="120" w:before="320" w:line="340" w:beforeAutospacing="false" w:afterAutospacing="false"/>
+        <w:contextualSpacing w:val="false"/>
+      </w:pPr>
+      <w:r>
+        <w:rPr>
+          <w:rFonts w:ascii="Arial" w:cs="Arial" w:eastAsia="Arial" w:hAnsi="Arial"/>
+          <w:b/>
+          <w:bCs/>
+          <w:color w:val="1D2021"/>
+          <w:sz w:val="22"/>
+          <w:szCs w:val="22"/>
+        </w:rPr>
+        <w:t xml:space="preserve">7. General Authorizing Resolution.</w:t>
+      </w:r>
+    </w:p>
+    <w:p>
+      <w:pPr>
+        <w:pStyle w:val="OAClauseBody"/>
+        <w:spacing w:after="280" w:before="0" w:line="340" w:beforeAutospacing="false" w:afterAutospacing="false"/>
+        <w:contextualSpacing w:val="false"/>
+      </w:pPr>
+      <w:r>
+        <w:rPr>
+          <w:rFonts w:ascii="Arial" w:cs="Arial" w:eastAsia="Arial" w:hAnsi="Arial"/>
+          <w:b w:val="false"/>
+          <w:bCs w:val="false"/>
+          <w:i w:val="false"/>
+          <w:iCs w:val="false"/>
+          <w:color w:val="1D2021"/>
+          <w:sz w:val="22"/>
+          <w:szCs w:val="22"/>
+        </w:rPr>
+        <w:t xml:space="preserve">RESOLVED, that the officers of the Company be, and each of them hereby is, authorized and directed, for and on behalf of the Company, to take such further actions and execute such documents as may be necessary or appropriate in order to implement the foregoing resolutions.</w:t>
       </w:r>
     </w:p>
     <w:p>
@@ -725,21 +1033,15 @@
           <w:i w:val="false"/>
           <w:iCs w:val="false"/>
           <w:color w:val="1D2021"/>
-          <w:sz w:val="16"/>
-          <w:szCs w:val="16"/>
-        </w:rPr>
-        <w:t xml:space="preserve">This Action by Written Consent shall be filed with the minutes of the proceedings of the Board of Directors of Company.</w:t>
-      </w:r>
-    </w:p>
-    <w:p>
-      <w:pPr>
-        <w:spacing w:after="280" w:before="0" w:line="340" w:beforeAutospacing="false" w:afterAutospacing="false"/>
-        <w:contextualSpacing w:val="false"/>
-      </w:pPr>
-    </w:p>
-    <w:p>
-      <w:pPr>
-        <w:spacing w:after="280" w:before="0" w:line="340" w:beforeAutospacing="false" w:afterAutospacing="false"/>
+          <w:sz w:val="22"/>
+          <w:szCs w:val="22"/>
+        </w:rPr>
+        <w:t xml:space="preserve">This Board Consent shall be filed with the minutes of the proceedings of the Board.</w:t>
+      </w:r>
+    </w:p>
+    <w:p>
+      <w:pPr>
+        <w:spacing w:after="280" w:before="280" w:line="340" w:beforeAutospacing="false" w:afterAutospacing="false"/>
         <w:contextualSpacing w:val="false"/>
       </w:pPr>
       <w:r>
@@ -750,10 +1052,10 @@
           <w:i w:val="false"/>
           <w:iCs w:val="false"/>
           <w:color w:val="1D2021"/>
-          <w:sz w:val="16"/>
-          <w:szCs w:val="16"/>
-        </w:rPr>
-        <w:t xml:space="preserve">By signing below, each director adopts this board consent as of the effective date listed in Cover Terms. Any copy, facsimile, PDF, or other reliable reproduction of this board consent may be substituted or used in lieu of the original writing for any purpose for which the original writing could be used, provided that the reproduction is a complete reproduction of the entire original writing.</w:t>
+          <w:sz w:val="22"/>
+          <w:szCs w:val="22"/>
+        </w:rPr>
+        <w:t xml:space="preserve">Each director signs this Board Consent solely in his or her capacity as a director of the Company, and not in any personal capacity as an investor, purchaser, or party to any SAFE.</w:t>
       </w:r>
     </w:p>
     <w:p>
@@ -1204,7 +1506,7 @@
               <w:sz w:val="18"/>
               <w:szCs w:val="18"/>
             </w:rPr>
-            <w:t xml:space="preserve">COVER TERMS</w:t>
+            <w:t xml:space="preserve">BOARD CONSENT (APPROVING SAFE) | DELAWARE</w:t>
           </w:r>
         </w:p>
       </w:tc>
@@ -1295,7 +1597,7 @@
               <w:sz w:val="18"/>
               <w:szCs w:val="18"/>
             </w:rPr>
-            <w:t xml:space="preserve">STANDARD TERMS</w:t>
+            <w:t xml:space="preserve">RESOLUTIONS</w:t>
           </w:r>
         </w:p>
       </w:tc>

</xml_diff>

<commit_message>
refactor: clarify SAFE board consent cover language
</commit_message>
<xml_diff>
--- a/content/templates/openagreements-board-consent-safe/template.docx
+++ b/content/templates/openagreements-board-consent-safe/template.docx
@@ -64,7 +64,7 @@
                 <w:sz w:val="22"/>
                 <w:szCs w:val="22"/>
               </w:rPr>
-              <w:t xml:space="preserve">Cover Terms</w:t>
+              <w:t xml:space="preserve">Key Terms of Board Consent</w:t>
             </w:r>
           </w:p>
           <w:p>
@@ -78,7 +78,7 @@
                 <w:sz w:val="16"/>
                 <w:szCs w:val="16"/>
               </w:rPr>
-              <w:t xml:space="preserve">The key terms reflected on this cover page are as follows. This action by written consent of the Board (this "Board Consent") consists of (a) this cover page (this "Cover Page") and (b) the resolutions attached hereto (the "Resolutions"). If there is any conflict between the Cover Page and the Resolutions, the Cover Page controls.</w:t>
+              <w:t xml:space="preserve">The key terms reflected on this cover page are as follows. In this Board Consent, {company_name}, a Delaware corporation, is referred to as the "Company". This action by written consent of the Board (this "Board Consent") consists of (a) this cover page (this "Cover Page") and (b) the resolutions attached hereto (the "Resolutions"). If there is any conflict between the Cover Page and the Resolutions, the Cover Page controls.</w:t>
             </w:r>
           </w:p>
         </w:tc>
@@ -270,7 +270,7 @@
                 <w:sz w:val="22"/>
                 <w:szCs w:val="22"/>
               </w:rPr>
-              <w:t xml:space="preserve">Instrument</w:t>
+              <w:t xml:space="preserve">SAFE</w:t>
             </w:r>
           </w:p>
         </w:tc>
@@ -680,7 +680,7 @@
           <w:sz w:val="22"/>
           <w:szCs w:val="22"/>
         </w:rPr>
-        <w:t xml:space="preserve">The undersigned, constituting all of the members of the Board of Directors (the "Board") of {company_name}, a Delaware corporation (the "Company"), pursuant to Section 141(f) of the Delaware General Corporation Law, hereby adopt the following resolutions by written consent.</w:t>
+        <w:t xml:space="preserve">The undersigned, constituting all of the members of the Board of Directors (the "Board") of the Company, pursuant to Section 141(f) of the Delaware General Corporation Law, hereby adopt the following resolutions by written consent.</w:t>
       </w:r>
     </w:p>
     <w:p>
@@ -700,7 +700,7 @@
           <w:sz w:val="22"/>
           <w:szCs w:val="22"/>
         </w:rPr>
-        <w:t xml:space="preserve">This action by written consent (this "Board Consent") records the approval reflected on the Cover Page and the resolutions below.</w:t>
+        <w:t xml:space="preserve">This Board Consent records the approval reflected on the Cover Page and the resolutions below.</w:t>
       </w:r>
     </w:p>
     <w:p>
@@ -738,7 +738,7 @@
           <w:sz w:val="22"/>
           <w:szCs w:val="22"/>
         </w:rPr>
-        <w:t xml:space="preserve">WHEREAS, the Board believes it is in the best interests of the Company to approve the issuance by the Company of one or more SAFEs (each, a "SAFE", and together, the "SAFEs"), of the type described in the Cover Terms, for an aggregate purchase amount of up to the Maximum Aggregate SAFE Purchase Amount listed in the Cover Terms, in accordance with their terms.</w:t>
+        <w:t xml:space="preserve">WHEREAS, the Board believes it is in the best interests of the Company to approve the issuance by the Company of one or more SAFEs (each, a "SAFE", and together, the "SAFEs"), of the type described on the Cover Page, each of which gives its holder a future right to receive shares of the Company's capital stock in accordance with its terms, for an aggregate purchase amount of up to the Maximum Aggregate SAFE Purchase Amount listed on the Cover Page.</w:t>
       </w:r>
     </w:p>
     <w:p>
@@ -1055,7 +1055,26 @@
           <w:sz w:val="22"/>
           <w:szCs w:val="22"/>
         </w:rPr>
-        <w:t xml:space="preserve">Each director signs this Board Consent solely in his or her capacity as a director of the Company, and not in any personal capacity as an investor, purchaser, or party to any SAFE.</w:t>
+        <w:t xml:space="preserve">By signing below, each director adopts this Board Consent, including the Cover Page and the Resolutions attached hereto.</w:t>
+      </w:r>
+    </w:p>
+    <w:p>
+      <w:pPr>
+        <w:spacing w:after="280" w:before="280" w:line="340" w:beforeAutospacing="false" w:afterAutospacing="false"/>
+        <w:contextualSpacing w:val="false"/>
+      </w:pPr>
+      <w:r>
+        <w:rPr>
+          <w:rFonts w:ascii="Arial" w:cs="Arial" w:eastAsia="Arial" w:hAnsi="Arial"/>
+          <w:b w:val="false"/>
+          <w:bCs w:val="false"/>
+          <w:i w:val="false"/>
+          <w:iCs w:val="false"/>
+          <w:color w:val="1D2021"/>
+          <w:sz w:val="22"/>
+          <w:szCs w:val="22"/>
+        </w:rPr>
+        <w:t xml:space="preserve">Each director signs this Board Consent solely in his or her capacity as a director of the Company.</w:t>
       </w:r>
     </w:p>
     <w:p>
@@ -1506,7 +1525,7 @@
               <w:sz w:val="18"/>
               <w:szCs w:val="18"/>
             </w:rPr>
-            <w:t xml:space="preserve">BOARD CONSENT (APPROVING SAFE) | DELAWARE</w:t>
+            <w:t xml:space="preserve">BOARD CONSENT (APPROVING SAFE ISSUANCE) | DELAWARE</w:t>
           </w:r>
         </w:p>
       </w:tc>
@@ -1688,7 +1707,7 @@
               <w:sz w:val="18"/>
               <w:szCs w:val="18"/>
             </w:rPr>
-            <w:t xml:space="preserve">SIGNATURE PAGE</w:t>
+            <w:t xml:space="preserve">SIGNATURE PAGE TO BOARD CONSENT (APPROVING SAFE ISSUANCE)</w:t>
           </w:r>
         </w:p>
       </w:tc>

</xml_diff>

<commit_message>
chore(snapshots): regenerate templates + trust artifacts
Run after the consent fix-up so downstream consumers see canonical state:
- data/templates-snapshot.json drops "Canonically authored in Contract IR"
  prose and gains the new SAFE cover-page fields (safe_valuation_cap,
  safe_discount_rate, safe_changes_to_standard_terms).
- site/_data/templateEvidence.json reflects the correct totalFields per
  consent.
- site/trust/system-card.md no longer hyperlinks to deleted Contract IR
  test files.
- All branded template DOCX artifacts re-rendered through the shared
  layout so the bold signer label paragraphs land in the consents and
  unrelated templates rebuild deterministically.
</commit_message>
<xml_diff>
--- a/content/templates/openagreements-board-consent-safe/template.docx
+++ b/content/templates/openagreements-board-consent-safe/template.docx
@@ -1074,7 +1074,7 @@
           <w:sz w:val="22"/>
           <w:szCs w:val="22"/>
         </w:rPr>
-        <w:t xml:space="preserve">Each director signs this Board Consent solely in his or her capacity as a director of the Company.</w:t>
+        <w:t xml:space="preserve">Each director signs this Board Consent solely in his or her capacity as a director of the Company, and not as a purchaser of any SAFE.</w:t>
       </w:r>
     </w:p>
     <w:p>
@@ -1104,6 +1104,25 @@
       <w:r>
         <w:rPr>
           <w:rFonts w:ascii="Arial" w:cs="Arial" w:eastAsia="Arial" w:hAnsi="Arial"/>
+          <w:b/>
+          <w:bCs/>
+          <w:i w:val="false"/>
+          <w:iCs w:val="false"/>
+          <w:color w:val="1D2021"/>
+          <w:sz w:val="22"/>
+          <w:szCs w:val="22"/>
+        </w:rPr>
+        <w:t xml:space="preserve">Director</w:t>
+      </w:r>
+    </w:p>
+    <w:p>
+      <w:pPr>
+        <w:spacing w:after="0" w:before="0" w:line="340" w:beforeAutospacing="false" w:afterAutospacing="false"/>
+        <w:contextualSpacing w:val="false"/>
+      </w:pPr>
+      <w:r>
+        <w:rPr>
+          <w:rFonts w:ascii="Arial" w:cs="Arial" w:eastAsia="Arial" w:hAnsi="Arial"/>
           <w:b w:val="false"/>
           <w:bCs w:val="false"/>
           <w:i w:val="false"/>
@@ -1131,7 +1150,7 @@
           <w:sz w:val="22"/>
           <w:szCs w:val="22"/>
         </w:rPr>
-        <w:t xml:space="preserve">{$member.name}</w:t>
+        <w:t xml:space="preserve">Print Name: {$member.name}</w:t>
       </w:r>
     </w:p>
     <w:p>

</xml_diff>

<commit_message>
fix(consents): restore paragraph spacing in traditional-consent layout
The traditional-consent-v1 layout hardcoded `after: 0` in both pPrDefault
and the Normal style, leaving paragraphs that fall through to defaults
(loop directives, signature lines, names, dates) with no vertical gap.
Use `style.spacing.body_after` so every paragraph has a sensible default
spacing while inline overrides still take precedence.

Regenerate board + stockholder SAFE consent templates.
</commit_message>
<xml_diff>
--- a/content/templates/openagreements-board-consent-safe/template.docx
+++ b/content/templates/openagreements-board-consent-safe/template.docx
@@ -793,7 +793,7 @@
     </w:rPrDefault>
     <w:pPrDefault>
       <w:pPr>
-        <w:spacing w:after="0" w:before="0" w:line="340" w:lineRule="auto"/>
+        <w:spacing w:after="280" w:before="0" w:line="340" w:lineRule="auto"/>
       </w:pPr>
     </w:pPrDefault>
   </w:docDefaults>
@@ -973,7 +973,7 @@
     <w:next w:val="Normal"/>
     <w:qFormat/>
     <w:pPr>
-      <w:spacing w:after="0" w:before="0" w:line="340" w:lineRule="auto"/>
+      <w:spacing w:after="280" w:before="0" w:line="340" w:lineRule="auto"/>
     </w:pPr>
     <w:rPr>
       <w:rFonts w:ascii="Times New Roman" w:cs="Times New Roman" w:eastAsia="Times New Roman" w:hAnsi="Times New Roman"/>

</xml_diff>